<commit_message>
Keep transcript in conversation order - reserve user line on speech commit
</commit_message>
<xml_diff>
--- a/Architecture/VoiceChat-Architecture.docx
+++ b/Architecture/VoiceChat-Architecture.docx
@@ -61,7 +61,7 @@
           <w:iCs/>
           <w:color w:val="5F8683"/>
         </w:rPr>
-        <w:t>Solution Architecture | v1.3 | As-Built Specification</w:t>
+        <w:t>Solution Architecture | v1.4 | As-Built Specification</w:t>
       </w:r>
     </w:p>
     <w:tbl>
@@ -128,7 +128,7 @@
               <w:spacing w:line="260" w:lineRule="auto"/>
             </w:pPr>
             <w:r>
-              <w:t>VOICECHAT-SA-v1.3</w:t>
+              <w:t>VOICECHAT-SA-v1.4</w:t>
             </w:r>
           </w:p>
         </w:tc>
@@ -176,7 +176,7 @@
               <w:spacing w:line="260" w:lineRule="auto"/>
             </w:pPr>
             <w:r>
-              <w:t>1.3 — As-Built Specification</w:t>
+              <w:t>1.4 — As-Built Specification</w:t>
             </w:r>
           </w:p>
         </w:tc>
@@ -608,7 +608,7 @@
       <w:pPr>
         <w:pStyle w:val="Heading1"/>
       </w:pPr>
-      <w:bookmarkStart w:id="0" w:name="_Toc237893302"/>
+      <w:bookmarkStart w:id="0" w:name="_Toc237895070"/>
       <w:r>
         <w:lastRenderedPageBreak/>
         <w:t>Change Log</w:t>
@@ -1015,6 +1015,87 @@
           </w:p>
         </w:tc>
       </w:tr>
+      <w:tr>
+        <w:tblPrEx>
+          <w:tblCellMar>
+            <w:top w:w="0" w:type="dxa"/>
+            <w:bottom w:w="0" w:type="dxa"/>
+          </w:tblCellMar>
+        </w:tblPrEx>
+        <w:tc>
+          <w:tcPr>
+            <w:tcW w:w="903" w:type="dxa"/>
+            <w:tcMar>
+              <w:top w:w="80" w:type="dxa"/>
+              <w:left w:w="110" w:type="dxa"/>
+              <w:bottom w:w="80" w:type="dxa"/>
+              <w:right w:w="110" w:type="dxa"/>
+            </w:tcMar>
+          </w:tcPr>
+          <w:p>
+            <w:pPr>
+              <w:spacing w:line="260" w:lineRule="auto"/>
+            </w:pPr>
+            <w:r>
+              <w:t>1.4</w:t>
+            </w:r>
+          </w:p>
+        </w:tc>
+        <w:tc>
+          <w:tcPr>
+            <w:tcW w:w="1003" w:type="dxa"/>
+            <w:tcMar>
+              <w:top w:w="80" w:type="dxa"/>
+              <w:left w:w="110" w:type="dxa"/>
+              <w:bottom w:w="80" w:type="dxa"/>
+              <w:right w:w="110" w:type="dxa"/>
+            </w:tcMar>
+          </w:tcPr>
+          <w:p>
+            <w:pPr>
+              <w:spacing w:line="260" w:lineRule="auto"/>
+            </w:pPr>
+            <w:r>
+              <w:t>Aug 2026</w:t>
+            </w:r>
+          </w:p>
+        </w:tc>
+        <w:tc>
+          <w:tcPr>
+            <w:tcW w:w="7121" w:type="dxa"/>
+            <w:tcMar>
+              <w:top w:w="80" w:type="dxa"/>
+              <w:left w:w="110" w:type="dxa"/>
+              <w:bottom w:w="80" w:type="dxa"/>
+              <w:right w:w="110" w:type="dxa"/>
+            </w:tcMar>
+          </w:tcPr>
+          <w:p>
+            <w:pPr>
+              <w:spacing w:line="260" w:lineRule="auto"/>
+            </w:pPr>
+            <w:r>
+              <w:t xml:space="preserve">Stabilisation release following live use. Transcript now kept in true conversation order by reserving the user's line on </w:t>
+            </w:r>
+            <w:proofErr w:type="spellStart"/>
+            <w:r>
+              <w:t>input_audio_buffer.committed</w:t>
+            </w:r>
+            <w:proofErr w:type="spellEnd"/>
+            <w:r>
+              <w:t xml:space="preserve"> and filling it by </w:t>
+            </w:r>
+            <w:proofErr w:type="spellStart"/>
+            <w:r>
+              <w:t>item_id</w:t>
+            </w:r>
+            <w:proofErr w:type="spellEnd"/>
+            <w:r>
+              <w:t xml:space="preserve"> when transcription arrives. Fixed layout shift during streaming (fixed transcript height, document scroll-anchoring off, speaker pill base class), the toolbar wrapping on connect, and the remove-document control not hiding its pill. This document added to the repository under architecture/. No architectural change.</w:t>
+            </w:r>
+          </w:p>
+        </w:tc>
+      </w:tr>
     </w:tbl>
     <w:p>
       <w:r>
@@ -1023,7 +1104,7 @@
     </w:p>
     <w:sdt>
       <w:sdtPr>
-        <w:id w:val="-179128128"/>
+        <w:id w:val="1907947133"/>
         <w:docPartObj>
           <w:docPartGallery w:val="Table of Contents"/>
           <w:docPartUnique/>
@@ -1074,7 +1155,7 @@
           <w:r>
             <w:fldChar w:fldCharType="separate"/>
           </w:r>
-          <w:hyperlink w:anchor="_Toc237893302" w:history="1">
+          <w:hyperlink w:anchor="_Toc237895070" w:history="1">
             <w:r>
               <w:rPr>
                 <w:rStyle w:val="Hyperlink"/>
@@ -1101,7 +1182,7 @@
                 <w:noProof/>
                 <w:webHidden/>
               </w:rPr>
-              <w:instrText xml:space="preserve"> PAGEREF _Toc237893302 \h </w:instrText>
+              <w:instrText xml:space="preserve"> PAGEREF _Toc237895070 \h </w:instrText>
             </w:r>
             <w:r>
               <w:rPr>
@@ -1147,7 +1228,7 @@
               <w14:ligatures w14:val="standardContextual"/>
             </w:rPr>
           </w:pPr>
-          <w:hyperlink w:anchor="_Toc237893303" w:history="1">
+          <w:hyperlink w:anchor="_Toc237895071" w:history="1">
             <w:r>
               <w:rPr>
                 <w:rStyle w:val="Hyperlink"/>
@@ -1174,7 +1255,7 @@
                 <w:noProof/>
                 <w:webHidden/>
               </w:rPr>
-              <w:instrText xml:space="preserve"> PAGEREF _Toc237893303 \h </w:instrText>
+              <w:instrText xml:space="preserve"> PAGEREF _Toc237895071 \h </w:instrText>
             </w:r>
             <w:r>
               <w:rPr>
@@ -1220,7 +1301,7 @@
               <w14:ligatures w14:val="standardContextual"/>
             </w:rPr>
           </w:pPr>
-          <w:hyperlink w:anchor="_Toc237893304" w:history="1">
+          <w:hyperlink w:anchor="_Toc237895072" w:history="1">
             <w:r>
               <w:rPr>
                 <w:rStyle w:val="Hyperlink"/>
@@ -1247,7 +1328,7 @@
                 <w:noProof/>
                 <w:webHidden/>
               </w:rPr>
-              <w:instrText xml:space="preserve"> PAGEREF _Toc237893304 \h </w:instrText>
+              <w:instrText xml:space="preserve"> PAGEREF _Toc237895072 \h </w:instrText>
             </w:r>
             <w:r>
               <w:rPr>
@@ -1293,7 +1374,7 @@
               <w14:ligatures w14:val="standardContextual"/>
             </w:rPr>
           </w:pPr>
-          <w:hyperlink w:anchor="_Toc237893305" w:history="1">
+          <w:hyperlink w:anchor="_Toc237895073" w:history="1">
             <w:r>
               <w:rPr>
                 <w:rStyle w:val="Hyperlink"/>
@@ -1320,7 +1401,7 @@
                 <w:noProof/>
                 <w:webHidden/>
               </w:rPr>
-              <w:instrText xml:space="preserve"> PAGEREF _Toc237893305 \h </w:instrText>
+              <w:instrText xml:space="preserve"> PAGEREF _Toc237895073 \h </w:instrText>
             </w:r>
             <w:r>
               <w:rPr>
@@ -1366,7 +1447,7 @@
               <w14:ligatures w14:val="standardContextual"/>
             </w:rPr>
           </w:pPr>
-          <w:hyperlink w:anchor="_Toc237893306" w:history="1">
+          <w:hyperlink w:anchor="_Toc237895074" w:history="1">
             <w:r>
               <w:rPr>
                 <w:rStyle w:val="Hyperlink"/>
@@ -1393,7 +1474,7 @@
                 <w:noProof/>
                 <w:webHidden/>
               </w:rPr>
-              <w:instrText xml:space="preserve"> PAGEREF _Toc237893306 \h </w:instrText>
+              <w:instrText xml:space="preserve"> PAGEREF _Toc237895074 \h </w:instrText>
             </w:r>
             <w:r>
               <w:rPr>
@@ -1439,7 +1520,7 @@
               <w14:ligatures w14:val="standardContextual"/>
             </w:rPr>
           </w:pPr>
-          <w:hyperlink w:anchor="_Toc237893307" w:history="1">
+          <w:hyperlink w:anchor="_Toc237895075" w:history="1">
             <w:r>
               <w:rPr>
                 <w:rStyle w:val="Hyperlink"/>
@@ -1466,7 +1547,7 @@
                 <w:noProof/>
                 <w:webHidden/>
               </w:rPr>
-              <w:instrText xml:space="preserve"> PAGEREF _Toc237893307 \h </w:instrText>
+              <w:instrText xml:space="preserve"> PAGEREF _Toc237895075 \h </w:instrText>
             </w:r>
             <w:r>
               <w:rPr>
@@ -1512,7 +1593,7 @@
               <w14:ligatures w14:val="standardContextual"/>
             </w:rPr>
           </w:pPr>
-          <w:hyperlink w:anchor="_Toc237893308" w:history="1">
+          <w:hyperlink w:anchor="_Toc237895076" w:history="1">
             <w:r>
               <w:rPr>
                 <w:rStyle w:val="Hyperlink"/>
@@ -1539,7 +1620,7 @@
                 <w:noProof/>
                 <w:webHidden/>
               </w:rPr>
-              <w:instrText xml:space="preserve"> PAGEREF _Toc237893308 \h </w:instrText>
+              <w:instrText xml:space="preserve"> PAGEREF _Toc237895076 \h </w:instrText>
             </w:r>
             <w:r>
               <w:rPr>
@@ -1585,7 +1666,7 @@
               <w14:ligatures w14:val="standardContextual"/>
             </w:rPr>
           </w:pPr>
-          <w:hyperlink w:anchor="_Toc237893309" w:history="1">
+          <w:hyperlink w:anchor="_Toc237895077" w:history="1">
             <w:r>
               <w:rPr>
                 <w:rStyle w:val="Hyperlink"/>
@@ -1612,7 +1693,7 @@
                 <w:noProof/>
                 <w:webHidden/>
               </w:rPr>
-              <w:instrText xml:space="preserve"> PAGEREF _Toc237893309 \h </w:instrText>
+              <w:instrText xml:space="preserve"> PAGEREF _Toc237895077 \h </w:instrText>
             </w:r>
             <w:r>
               <w:rPr>
@@ -1658,7 +1739,7 @@
               <w14:ligatures w14:val="standardContextual"/>
             </w:rPr>
           </w:pPr>
-          <w:hyperlink w:anchor="_Toc237893310" w:history="1">
+          <w:hyperlink w:anchor="_Toc237895078" w:history="1">
             <w:r>
               <w:rPr>
                 <w:rStyle w:val="Hyperlink"/>
@@ -1685,7 +1766,7 @@
                 <w:noProof/>
                 <w:webHidden/>
               </w:rPr>
-              <w:instrText xml:space="preserve"> PAGEREF _Toc237893310 \h </w:instrText>
+              <w:instrText xml:space="preserve"> PAGEREF _Toc237895078 \h </w:instrText>
             </w:r>
             <w:r>
               <w:rPr>
@@ -1731,7 +1812,7 @@
               <w14:ligatures w14:val="standardContextual"/>
             </w:rPr>
           </w:pPr>
-          <w:hyperlink w:anchor="_Toc237893311" w:history="1">
+          <w:hyperlink w:anchor="_Toc237895079" w:history="1">
             <w:r>
               <w:rPr>
                 <w:rStyle w:val="Hyperlink"/>
@@ -1758,7 +1839,7 @@
                 <w:noProof/>
                 <w:webHidden/>
               </w:rPr>
-              <w:instrText xml:space="preserve"> PAGEREF _Toc237893311 \h </w:instrText>
+              <w:instrText xml:space="preserve"> PAGEREF _Toc237895079 \h </w:instrText>
             </w:r>
             <w:r>
               <w:rPr>
@@ -1804,7 +1885,7 @@
               <w14:ligatures w14:val="standardContextual"/>
             </w:rPr>
           </w:pPr>
-          <w:hyperlink w:anchor="_Toc237893312" w:history="1">
+          <w:hyperlink w:anchor="_Toc237895080" w:history="1">
             <w:r>
               <w:rPr>
                 <w:rStyle w:val="Hyperlink"/>
@@ -1831,7 +1912,7 @@
                 <w:noProof/>
                 <w:webHidden/>
               </w:rPr>
-              <w:instrText xml:space="preserve"> PAGEREF _Toc237893312 \h </w:instrText>
+              <w:instrText xml:space="preserve"> PAGEREF _Toc237895080 \h </w:instrText>
             </w:r>
             <w:r>
               <w:rPr>
@@ -1877,7 +1958,7 @@
               <w14:ligatures w14:val="standardContextual"/>
             </w:rPr>
           </w:pPr>
-          <w:hyperlink w:anchor="_Toc237893313" w:history="1">
+          <w:hyperlink w:anchor="_Toc237895081" w:history="1">
             <w:r>
               <w:rPr>
                 <w:rStyle w:val="Hyperlink"/>
@@ -1904,7 +1985,7 @@
                 <w:noProof/>
                 <w:webHidden/>
               </w:rPr>
-              <w:instrText xml:space="preserve"> PAGEREF _Toc237893313 \h </w:instrText>
+              <w:instrText xml:space="preserve"> PAGEREF _Toc237895081 \h </w:instrText>
             </w:r>
             <w:r>
               <w:rPr>
@@ -1950,7 +2031,7 @@
               <w14:ligatures w14:val="standardContextual"/>
             </w:rPr>
           </w:pPr>
-          <w:hyperlink w:anchor="_Toc237893314" w:history="1">
+          <w:hyperlink w:anchor="_Toc237895082" w:history="1">
             <w:r>
               <w:rPr>
                 <w:rStyle w:val="Hyperlink"/>
@@ -1977,7 +2058,7 @@
                 <w:noProof/>
                 <w:webHidden/>
               </w:rPr>
-              <w:instrText xml:space="preserve"> PAGEREF _Toc237893314 \h </w:instrText>
+              <w:instrText xml:space="preserve"> PAGEREF _Toc237895082 \h </w:instrText>
             </w:r>
             <w:r>
               <w:rPr>
@@ -2023,7 +2104,7 @@
               <w14:ligatures w14:val="standardContextual"/>
             </w:rPr>
           </w:pPr>
-          <w:hyperlink w:anchor="_Toc237893315" w:history="1">
+          <w:hyperlink w:anchor="_Toc237895083" w:history="1">
             <w:r>
               <w:rPr>
                 <w:rStyle w:val="Hyperlink"/>
@@ -2050,7 +2131,7 @@
                 <w:noProof/>
                 <w:webHidden/>
               </w:rPr>
-              <w:instrText xml:space="preserve"> PAGEREF _Toc237893315 \h </w:instrText>
+              <w:instrText xml:space="preserve"> PAGEREF _Toc237895083 \h </w:instrText>
             </w:r>
             <w:r>
               <w:rPr>
@@ -2096,7 +2177,7 @@
               <w14:ligatures w14:val="standardContextual"/>
             </w:rPr>
           </w:pPr>
-          <w:hyperlink w:anchor="_Toc237893316" w:history="1">
+          <w:hyperlink w:anchor="_Toc237895084" w:history="1">
             <w:r>
               <w:rPr>
                 <w:rStyle w:val="Hyperlink"/>
@@ -2123,7 +2204,7 @@
                 <w:noProof/>
                 <w:webHidden/>
               </w:rPr>
-              <w:instrText xml:space="preserve"> PAGEREF _Toc237893316 \h </w:instrText>
+              <w:instrText xml:space="preserve"> PAGEREF _Toc237895084 \h </w:instrText>
             </w:r>
             <w:r>
               <w:rPr>
@@ -2169,7 +2250,7 @@
               <w14:ligatures w14:val="standardContextual"/>
             </w:rPr>
           </w:pPr>
-          <w:hyperlink w:anchor="_Toc237893317" w:history="1">
+          <w:hyperlink w:anchor="_Toc237895085" w:history="1">
             <w:r>
               <w:rPr>
                 <w:rStyle w:val="Hyperlink"/>
@@ -2196,7 +2277,7 @@
                 <w:noProof/>
                 <w:webHidden/>
               </w:rPr>
-              <w:instrText xml:space="preserve"> PAGEREF _Toc237893317 \h </w:instrText>
+              <w:instrText xml:space="preserve"> PAGEREF _Toc237895085 \h </w:instrText>
             </w:r>
             <w:r>
               <w:rPr>
@@ -2242,7 +2323,7 @@
               <w14:ligatures w14:val="standardContextual"/>
             </w:rPr>
           </w:pPr>
-          <w:hyperlink w:anchor="_Toc237893318" w:history="1">
+          <w:hyperlink w:anchor="_Toc237895086" w:history="1">
             <w:r>
               <w:rPr>
                 <w:rStyle w:val="Hyperlink"/>
@@ -2269,7 +2350,7 @@
                 <w:noProof/>
                 <w:webHidden/>
               </w:rPr>
-              <w:instrText xml:space="preserve"> PAGEREF _Toc237893318 \h </w:instrText>
+              <w:instrText xml:space="preserve"> PAGEREF _Toc237895086 \h </w:instrText>
             </w:r>
             <w:r>
               <w:rPr>
@@ -2315,7 +2396,7 @@
               <w14:ligatures w14:val="standardContextual"/>
             </w:rPr>
           </w:pPr>
-          <w:hyperlink w:anchor="_Toc237893319" w:history="1">
+          <w:hyperlink w:anchor="_Toc237895087" w:history="1">
             <w:r>
               <w:rPr>
                 <w:rStyle w:val="Hyperlink"/>
@@ -2342,7 +2423,7 @@
                 <w:noProof/>
                 <w:webHidden/>
               </w:rPr>
-              <w:instrText xml:space="preserve"> PAGEREF _Toc237893319 \h </w:instrText>
+              <w:instrText xml:space="preserve"> PAGEREF _Toc237895087 \h </w:instrText>
             </w:r>
             <w:r>
               <w:rPr>
@@ -2388,7 +2469,7 @@
               <w14:ligatures w14:val="standardContextual"/>
             </w:rPr>
           </w:pPr>
-          <w:hyperlink w:anchor="_Toc237893320" w:history="1">
+          <w:hyperlink w:anchor="_Toc237895088" w:history="1">
             <w:r>
               <w:rPr>
                 <w:rStyle w:val="Hyperlink"/>
@@ -2415,7 +2496,7 @@
                 <w:noProof/>
                 <w:webHidden/>
               </w:rPr>
-              <w:instrText xml:space="preserve"> PAGEREF _Toc237893320 \h </w:instrText>
+              <w:instrText xml:space="preserve"> PAGEREF _Toc237895088 \h </w:instrText>
             </w:r>
             <w:r>
               <w:rPr>
@@ -2435,7 +2516,7 @@
                 <w:noProof/>
                 <w:webHidden/>
               </w:rPr>
-              <w:t>11</w:t>
+              <w:t>12</w:t>
             </w:r>
             <w:r>
               <w:rPr>
@@ -2461,7 +2542,7 @@
               <w14:ligatures w14:val="standardContextual"/>
             </w:rPr>
           </w:pPr>
-          <w:hyperlink w:anchor="_Toc237893321" w:history="1">
+          <w:hyperlink w:anchor="_Toc237895089" w:history="1">
             <w:r>
               <w:rPr>
                 <w:rStyle w:val="Hyperlink"/>
@@ -2488,7 +2569,7 @@
                 <w:noProof/>
                 <w:webHidden/>
               </w:rPr>
-              <w:instrText xml:space="preserve"> PAGEREF _Toc237893321 \h </w:instrText>
+              <w:instrText xml:space="preserve"> PAGEREF _Toc237895089 \h </w:instrText>
             </w:r>
             <w:r>
               <w:rPr>
@@ -2534,7 +2615,7 @@
               <w14:ligatures w14:val="standardContextual"/>
             </w:rPr>
           </w:pPr>
-          <w:hyperlink w:anchor="_Toc237893322" w:history="1">
+          <w:hyperlink w:anchor="_Toc237895090" w:history="1">
             <w:r>
               <w:rPr>
                 <w:rStyle w:val="Hyperlink"/>
@@ -2561,7 +2642,7 @@
                 <w:noProof/>
                 <w:webHidden/>
               </w:rPr>
-              <w:instrText xml:space="preserve"> PAGEREF _Toc237893322 \h </w:instrText>
+              <w:instrText xml:space="preserve"> PAGEREF _Toc237895090 \h </w:instrText>
             </w:r>
             <w:r>
               <w:rPr>
@@ -2607,7 +2688,7 @@
               <w14:ligatures w14:val="standardContextual"/>
             </w:rPr>
           </w:pPr>
-          <w:hyperlink w:anchor="_Toc237893323" w:history="1">
+          <w:hyperlink w:anchor="_Toc237895091" w:history="1">
             <w:r>
               <w:rPr>
                 <w:rStyle w:val="Hyperlink"/>
@@ -2634,7 +2715,7 @@
                 <w:noProof/>
                 <w:webHidden/>
               </w:rPr>
-              <w:instrText xml:space="preserve"> PAGEREF _Toc237893323 \h </w:instrText>
+              <w:instrText xml:space="preserve"> PAGEREF _Toc237895091 \h </w:instrText>
             </w:r>
             <w:r>
               <w:rPr>
@@ -2680,7 +2761,7 @@
               <w14:ligatures w14:val="standardContextual"/>
             </w:rPr>
           </w:pPr>
-          <w:hyperlink w:anchor="_Toc237893324" w:history="1">
+          <w:hyperlink w:anchor="_Toc237895092" w:history="1">
             <w:r>
               <w:rPr>
                 <w:rStyle w:val="Hyperlink"/>
@@ -2707,7 +2788,7 @@
                 <w:noProof/>
                 <w:webHidden/>
               </w:rPr>
-              <w:instrText xml:space="preserve"> PAGEREF _Toc237893324 \h </w:instrText>
+              <w:instrText xml:space="preserve"> PAGEREF _Toc237895092 \h </w:instrText>
             </w:r>
             <w:r>
               <w:rPr>
@@ -2753,7 +2834,7 @@
               <w14:ligatures w14:val="standardContextual"/>
             </w:rPr>
           </w:pPr>
-          <w:hyperlink w:anchor="_Toc237893325" w:history="1">
+          <w:hyperlink w:anchor="_Toc237895093" w:history="1">
             <w:r>
               <w:rPr>
                 <w:rStyle w:val="Hyperlink"/>
@@ -2780,7 +2861,7 @@
                 <w:noProof/>
                 <w:webHidden/>
               </w:rPr>
-              <w:instrText xml:space="preserve"> PAGEREF _Toc237893325 \h </w:instrText>
+              <w:instrText xml:space="preserve"> PAGEREF _Toc237895093 \h </w:instrText>
             </w:r>
             <w:r>
               <w:rPr>
@@ -2800,7 +2881,7 @@
                 <w:noProof/>
                 <w:webHidden/>
               </w:rPr>
-              <w:t>12</w:t>
+              <w:t>13</w:t>
             </w:r>
             <w:r>
               <w:rPr>
@@ -2826,7 +2907,7 @@
               <w14:ligatures w14:val="standardContextual"/>
             </w:rPr>
           </w:pPr>
-          <w:hyperlink w:anchor="_Toc237893326" w:history="1">
+          <w:hyperlink w:anchor="_Toc237895094" w:history="1">
             <w:r>
               <w:rPr>
                 <w:rStyle w:val="Hyperlink"/>
@@ -2853,7 +2934,7 @@
                 <w:noProof/>
                 <w:webHidden/>
               </w:rPr>
-              <w:instrText xml:space="preserve"> PAGEREF _Toc237893326 \h </w:instrText>
+              <w:instrText xml:space="preserve"> PAGEREF _Toc237895094 \h </w:instrText>
             </w:r>
             <w:r>
               <w:rPr>
@@ -2873,7 +2954,7 @@
                 <w:noProof/>
                 <w:webHidden/>
               </w:rPr>
-              <w:t>12</w:t>
+              <w:t>13</w:t>
             </w:r>
             <w:r>
               <w:rPr>
@@ -2899,7 +2980,7 @@
               <w14:ligatures w14:val="standardContextual"/>
             </w:rPr>
           </w:pPr>
-          <w:hyperlink w:anchor="_Toc237893327" w:history="1">
+          <w:hyperlink w:anchor="_Toc237895095" w:history="1">
             <w:r>
               <w:rPr>
                 <w:rStyle w:val="Hyperlink"/>
@@ -2926,7 +3007,7 @@
                 <w:noProof/>
                 <w:webHidden/>
               </w:rPr>
-              <w:instrText xml:space="preserve"> PAGEREF _Toc237893327 \h </w:instrText>
+              <w:instrText xml:space="preserve"> PAGEREF _Toc237895095 \h </w:instrText>
             </w:r>
             <w:r>
               <w:rPr>
@@ -2946,7 +3027,7 @@
                 <w:noProof/>
                 <w:webHidden/>
               </w:rPr>
-              <w:t>12</w:t>
+              <w:t>13</w:t>
             </w:r>
             <w:r>
               <w:rPr>
@@ -2972,7 +3053,7 @@
               <w14:ligatures w14:val="standardContextual"/>
             </w:rPr>
           </w:pPr>
-          <w:hyperlink w:anchor="_Toc237893328" w:history="1">
+          <w:hyperlink w:anchor="_Toc237895096" w:history="1">
             <w:r>
               <w:rPr>
                 <w:rStyle w:val="Hyperlink"/>
@@ -2999,7 +3080,7 @@
                 <w:noProof/>
                 <w:webHidden/>
               </w:rPr>
-              <w:instrText xml:space="preserve"> PAGEREF _Toc237893328 \h </w:instrText>
+              <w:instrText xml:space="preserve"> PAGEREF _Toc237895096 \h </w:instrText>
             </w:r>
             <w:r>
               <w:rPr>
@@ -3019,7 +3100,7 @@
                 <w:noProof/>
                 <w:webHidden/>
               </w:rPr>
-              <w:t>12</w:t>
+              <w:t>13</w:t>
             </w:r>
             <w:r>
               <w:rPr>
@@ -3045,7 +3126,7 @@
               <w14:ligatures w14:val="standardContextual"/>
             </w:rPr>
           </w:pPr>
-          <w:hyperlink w:anchor="_Toc237893329" w:history="1">
+          <w:hyperlink w:anchor="_Toc237895097" w:history="1">
             <w:r>
               <w:rPr>
                 <w:rStyle w:val="Hyperlink"/>
@@ -3072,7 +3153,7 @@
                 <w:noProof/>
                 <w:webHidden/>
               </w:rPr>
-              <w:instrText xml:space="preserve"> PAGEREF _Toc237893329 \h </w:instrText>
+              <w:instrText xml:space="preserve"> PAGEREF _Toc237895097 \h </w:instrText>
             </w:r>
             <w:r>
               <w:rPr>
@@ -3124,7 +3205,7 @@
       <w:pPr>
         <w:pStyle w:val="Heading1"/>
       </w:pPr>
-      <w:bookmarkStart w:id="1" w:name="_Toc237893303"/>
+      <w:bookmarkStart w:id="1" w:name="_Toc237895071"/>
       <w:r>
         <w:lastRenderedPageBreak/>
         <w:t xml:space="preserve">1. What AI </w:t>
@@ -3241,7 +3322,7 @@
       <w:pPr>
         <w:pStyle w:val="Heading1"/>
       </w:pPr>
-      <w:bookmarkStart w:id="2" w:name="_Toc237893304"/>
+      <w:bookmarkStart w:id="2" w:name="_Toc237895072"/>
       <w:r>
         <w:t>2. Architecture Decision — Browser Talks Directly to OpenAI</w:t>
       </w:r>
@@ -3369,7 +3450,7 @@
       <w:pPr>
         <w:pStyle w:val="Heading1"/>
       </w:pPr>
-      <w:bookmarkStart w:id="3" w:name="_Toc237893305"/>
+      <w:bookmarkStart w:id="3" w:name="_Toc237895073"/>
       <w:r>
         <w:t>3. Solution Structure</w:t>
       </w:r>
@@ -3862,7 +3943,7 @@
       <w:pPr>
         <w:pStyle w:val="Heading1"/>
       </w:pPr>
-      <w:bookmarkStart w:id="4" w:name="_Toc237893306"/>
+      <w:bookmarkStart w:id="4" w:name="_Toc237895074"/>
       <w:r>
         <w:t>4. Technology Stack</w:t>
       </w:r>
@@ -3872,7 +3953,7 @@
       <w:pPr>
         <w:pStyle w:val="Heading2"/>
       </w:pPr>
-      <w:bookmarkStart w:id="5" w:name="_Toc237893307"/>
+      <w:bookmarkStart w:id="5" w:name="_Toc237895075"/>
       <w:r>
         <w:t>4.1 NuGet Packages</w:t>
       </w:r>
@@ -4077,7 +4158,7 @@
       <w:pPr>
         <w:pStyle w:val="Heading2"/>
       </w:pPr>
-      <w:bookmarkStart w:id="6" w:name="_Toc237893308"/>
+      <w:bookmarkStart w:id="6" w:name="_Toc237895076"/>
       <w:r>
         <w:t>4.2 External Services</w:t>
       </w:r>
@@ -4291,7 +4372,7 @@
       <w:pPr>
         <w:pStyle w:val="Heading1"/>
       </w:pPr>
-      <w:bookmarkStart w:id="7" w:name="_Toc237893309"/>
+      <w:bookmarkStart w:id="7" w:name="_Toc237895077"/>
       <w:r>
         <w:t>5. Project File Structure</w:t>
       </w:r>
@@ -5317,6 +5398,60 @@
           </w:p>
         </w:tc>
       </w:tr>
+      <w:tr>
+        <w:tblPrEx>
+          <w:tblCellMar>
+            <w:top w:w="0" w:type="dxa"/>
+            <w:bottom w:w="0" w:type="dxa"/>
+          </w:tblCellMar>
+        </w:tblPrEx>
+        <w:tc>
+          <w:tcPr>
+            <w:tcW w:w="2908" w:type="dxa"/>
+            <w:tcMar>
+              <w:top w:w="80" w:type="dxa"/>
+              <w:left w:w="110" w:type="dxa"/>
+              <w:bottom w:w="80" w:type="dxa"/>
+              <w:right w:w="110" w:type="dxa"/>
+            </w:tcMar>
+          </w:tcPr>
+          <w:p>
+            <w:pPr>
+              <w:spacing w:line="260" w:lineRule="auto"/>
+            </w:pPr>
+            <w:r>
+              <w:t>architecture/</w:t>
+            </w:r>
+          </w:p>
+        </w:tc>
+        <w:tc>
+          <w:tcPr>
+            <w:tcW w:w="6118" w:type="dxa"/>
+            <w:tcMar>
+              <w:top w:w="80" w:type="dxa"/>
+              <w:left w:w="110" w:type="dxa"/>
+              <w:bottom w:w="80" w:type="dxa"/>
+              <w:right w:w="110" w:type="dxa"/>
+            </w:tcMar>
+          </w:tcPr>
+          <w:p>
+            <w:pPr>
+              <w:spacing w:line="260" w:lineRule="auto"/>
+            </w:pPr>
+            <w:r>
+              <w:t>This document. Committed to the repository; excluded from the Docker image via .</w:t>
+            </w:r>
+            <w:proofErr w:type="spellStart"/>
+            <w:r>
+              <w:t>dockerignore</w:t>
+            </w:r>
+            <w:proofErr w:type="spellEnd"/>
+            <w:r>
+              <w:t>.</w:t>
+            </w:r>
+          </w:p>
+        </w:tc>
+      </w:tr>
     </w:tbl>
     <w:p>
       <w:pPr>
@@ -5327,7 +5462,7 @@
       <w:pPr>
         <w:pStyle w:val="Heading1"/>
       </w:pPr>
-      <w:bookmarkStart w:id="8" w:name="_Toc237893310"/>
+      <w:bookmarkStart w:id="8" w:name="_Toc237895078"/>
       <w:r>
         <w:t>6. Architecture Overview</w:t>
       </w:r>
@@ -5337,7 +5472,7 @@
       <w:pPr>
         <w:pStyle w:val="Heading2"/>
       </w:pPr>
-      <w:bookmarkStart w:id="9" w:name="_Toc237893311"/>
+      <w:bookmarkStart w:id="9" w:name="_Toc237895079"/>
       <w:r>
         <w:t>6.1 Layers</w:t>
       </w:r>
@@ -5883,7 +6018,7 @@
       <w:pPr>
         <w:pStyle w:val="Heading2"/>
       </w:pPr>
-      <w:bookmarkStart w:id="10" w:name="_Toc237893312"/>
+      <w:bookmarkStart w:id="10" w:name="_Toc237895080"/>
       <w:r>
         <w:t>6.2 Data Flow — Starting a Conversation</w:t>
       </w:r>
@@ -6088,7 +6223,7 @@
       <w:pPr>
         <w:pStyle w:val="Heading2"/>
       </w:pPr>
-      <w:bookmarkStart w:id="11" w:name="_Toc237893313"/>
+      <w:bookmarkStart w:id="11" w:name="_Toc237895081"/>
       <w:r>
         <w:t>6.3 Data Flow — Attaching a Document</w:t>
       </w:r>
@@ -6166,7 +6301,7 @@
       <w:pPr>
         <w:pStyle w:val="Heading2"/>
       </w:pPr>
-      <w:bookmarkStart w:id="12" w:name="_Toc237893314"/>
+      <w:bookmarkStart w:id="12" w:name="_Toc237895082"/>
       <w:r>
         <w:t>6.4 Data Flow — During the Call</w:t>
       </w:r>
@@ -6195,7 +6330,7 @@
         <w:spacing w:after="100" w:line="276" w:lineRule="auto"/>
       </w:pPr>
       <w:r>
-        <w:t xml:space="preserve">Transcript deltas arrive on the data channel: </w:t>
+        <w:t xml:space="preserve">Transcript events arrive on the data channel. For the model, </w:t>
       </w:r>
       <w:proofErr w:type="spellStart"/>
       <w:r>
@@ -6203,15 +6338,31 @@
       </w:r>
       <w:proofErr w:type="spellEnd"/>
       <w:r>
-        <w:t xml:space="preserve"> for the model, </w:t>
+        <w:t xml:space="preserve"> streams words as they are spoken. For the user, </w:t>
       </w:r>
       <w:proofErr w:type="spellStart"/>
       <w:r>
+        <w:t>input_audio_buffer.committed</w:t>
+      </w:r>
+      <w:proofErr w:type="spellEnd"/>
+      <w:r>
+        <w:t xml:space="preserve"> fires the instant a turn ends (carrying an </w:t>
+      </w:r>
+      <w:proofErr w:type="spellStart"/>
+      <w:r>
+        <w:t>item_id</w:t>
+      </w:r>
+      <w:proofErr w:type="spellEnd"/>
+      <w:r>
+        <w:t xml:space="preserve">), and </w:t>
+      </w:r>
+      <w:proofErr w:type="spellStart"/>
+      <w:r>
         <w:t>conversation.item.input_audio_transcription.completed</w:t>
       </w:r>
       <w:proofErr w:type="spellEnd"/>
       <w:r>
-        <w:t xml:space="preserve"> for the user. The browser appends them to the transcript panel and to an in-memory array.</w:t>
+        <w:t xml:space="preserve"> follows a moment later with the words — frequently after the model has already begun its reply.</w:t>
       </w:r>
     </w:p>
     <w:p>
@@ -6224,7 +6375,24 @@
         <w:spacing w:after="100" w:line="276" w:lineRule="auto"/>
       </w:pPr>
       <w:r>
-        <w:t>The visualiser compares mic and model levels each frame, colours the bars blue (user) or amber (model), and updates the speaker pill.</w:t>
+        <w:lastRenderedPageBreak/>
+        <w:t xml:space="preserve">To keep the panel in true </w:t>
+      </w:r>
+      <w:proofErr w:type="gramStart"/>
+      <w:r>
+        <w:t>conversation</w:t>
+      </w:r>
+      <w:proofErr w:type="gramEnd"/>
+      <w:r>
+        <w:t xml:space="preserve"> order the browser reserves the user's line with a placeholder on committed, keyed by </w:t>
+      </w:r>
+      <w:proofErr w:type="spellStart"/>
+      <w:r>
+        <w:t>item_id</w:t>
+      </w:r>
+      <w:proofErr w:type="spellEnd"/>
+      <w:r>
+        <w:t>, and fills it in when the transcription arrives. Model lines are keyed the same way. Lines are also captured in an in-memory array for export.</w:t>
       </w:r>
     </w:p>
     <w:p>
@@ -6237,7 +6405,19 @@
         <w:spacing w:after="100" w:line="276" w:lineRule="auto"/>
       </w:pPr>
       <w:r>
-        <w:lastRenderedPageBreak/>
+        <w:t>The visualiser compares mic and model levels each frame, colours the bars blue (user) or amber (model), and updates the speaker pill.</w:t>
+      </w:r>
+    </w:p>
+    <w:p>
+      <w:pPr>
+        <w:pStyle w:val="ListParagraph"/>
+        <w:numPr>
+          <w:ilvl w:val="0"/>
+          <w:numId w:val="2"/>
+        </w:numPr>
+        <w:spacing w:after="100" w:line="276" w:lineRule="auto"/>
+      </w:pPr>
+      <w:r>
         <w:t>End closes the data channel, the peer connection and the mic tracks. The transcript stays on screen for Copy / Download.</w:t>
       </w:r>
     </w:p>
@@ -6250,7 +6430,7 @@
       <w:pPr>
         <w:pStyle w:val="Heading1"/>
       </w:pPr>
-      <w:bookmarkStart w:id="13" w:name="_Toc237893315"/>
+      <w:bookmarkStart w:id="13" w:name="_Toc237895083"/>
       <w:r>
         <w:t>7. Persona Model</w:t>
       </w:r>
@@ -7044,7 +7224,7 @@
       <w:pPr>
         <w:pStyle w:val="Heading1"/>
       </w:pPr>
-      <w:bookmarkStart w:id="14" w:name="_Toc237893316"/>
+      <w:bookmarkStart w:id="14" w:name="_Toc237895084"/>
       <w:r>
         <w:t>8. OpenAI Realtime Integration</w:t>
       </w:r>
@@ -7102,6 +7282,7 @@
                 <w:bCs/>
                 <w:color w:val="FFFFFF"/>
               </w:rPr>
+              <w:lastRenderedPageBreak/>
               <w:t>Aspect</w:t>
             </w:r>
           </w:p>
@@ -7200,7 +7381,6 @@
               <w:spacing w:line="260" w:lineRule="auto"/>
             </w:pPr>
             <w:r>
-              <w:lastRenderedPageBreak/>
               <w:t>Voice</w:t>
             </w:r>
           </w:p>
@@ -7528,11 +7708,19 @@
             </w:r>
             <w:proofErr w:type="spellStart"/>
             <w:r>
+              <w:t>input_audio_buffer.committed</w:t>
+            </w:r>
+            <w:proofErr w:type="spellEnd"/>
+            <w:r>
+              <w:t xml:space="preserve">, </w:t>
+            </w:r>
+            <w:proofErr w:type="spellStart"/>
+            <w:r>
               <w:t>conversation.item.input_audio_transcription.completed</w:t>
             </w:r>
             <w:proofErr w:type="spellEnd"/>
             <w:r>
-              <w:t>, error. Beta-era names are also matched as a fallback.</w:t>
+              <w:t xml:space="preserve"> / .failed, error. Beta-era names are also matched as a fallback.</w:t>
             </w:r>
           </w:p>
         </w:tc>
@@ -7593,7 +7781,7 @@
       <w:pPr>
         <w:pStyle w:val="Heading1"/>
       </w:pPr>
-      <w:bookmarkStart w:id="15" w:name="_Toc237893317"/>
+      <w:bookmarkStart w:id="15" w:name="_Toc237895085"/>
       <w:r>
         <w:t>9. Document Ingestion</w:t>
       </w:r>
@@ -8440,6 +8628,7 @@
               <w:spacing w:line="260" w:lineRule="auto"/>
             </w:pPr>
             <w:r>
+              <w:lastRenderedPageBreak/>
               <w:t>Extracted length</w:t>
             </w:r>
           </w:p>
@@ -8478,11 +8667,7 @@
               <w:spacing w:line="260" w:lineRule="auto"/>
             </w:pPr>
             <w:r>
-              <w:t xml:space="preserve">Fits within the 128k context with room for conversation. Over the limit is rejected with a </w:t>
-            </w:r>
-            <w:r>
-              <w:lastRenderedPageBreak/>
-              <w:t>message; never truncated, because a silently truncated document yields confidently wrong analysis.</w:t>
+              <w:t>Fits within the 128k context with room for conversation. Over the limit is rejected with a message; never truncated, because a silently truncated document yields confidently wrong analysis.</w:t>
             </w:r>
           </w:p>
         </w:tc>
@@ -8509,7 +8694,6 @@
               <w:spacing w:line="260" w:lineRule="auto"/>
             </w:pPr>
             <w:r>
-              <w:lastRenderedPageBreak/>
               <w:t>Retention</w:t>
             </w:r>
           </w:p>
@@ -8657,7 +8841,7 @@
       <w:pPr>
         <w:pStyle w:val="Heading1"/>
       </w:pPr>
-      <w:bookmarkStart w:id="16" w:name="_Toc237893318"/>
+      <w:bookmarkStart w:id="16" w:name="_Toc237895086"/>
       <w:r>
         <w:t>10. Configuration Reference</w:t>
       </w:r>
@@ -9328,7 +9512,7 @@
       <w:pPr>
         <w:pStyle w:val="Heading1"/>
       </w:pPr>
-      <w:bookmarkStart w:id="17" w:name="_Toc237893319"/>
+      <w:bookmarkStart w:id="17" w:name="_Toc237895087"/>
       <w:r>
         <w:t>11. Known Issues and Build Learnings</w:t>
       </w:r>
@@ -9394,6 +9578,7 @@
                 <w:bCs/>
                 <w:color w:val="FFFFFF"/>
               </w:rPr>
+              <w:lastRenderedPageBreak/>
               <w:t>Issue</w:t>
             </w:r>
           </w:p>
@@ -9481,11 +9666,7 @@
             </w:r>
             <w:proofErr w:type="spellEnd"/>
             <w:r>
-              <w:t xml:space="preserve">, so the AI transcript </w:t>
-            </w:r>
-            <w:r>
-              <w:lastRenderedPageBreak/>
-              <w:t>panel stayed empty with no error. Fixed by matching the GA names, keeping beta names as fallbacks, and logging any error event to the console.</w:t>
+              <w:t>, so the AI transcript panel stayed empty with no error. Fixed by matching the GA names, keeping beta names as fallbacks, and logging any error event to the console.</w:t>
             </w:r>
           </w:p>
         </w:tc>
@@ -9512,7 +9693,6 @@
               <w:spacing w:line="260" w:lineRule="auto"/>
             </w:pPr>
             <w:r>
-              <w:lastRenderedPageBreak/>
               <w:t xml:space="preserve">A </w:t>
             </w:r>
             <w:proofErr w:type="spellStart"/>
@@ -9910,6 +10090,240 @@
             </w:pPr>
             <w:r>
               <w:t>The first visualiser was a 160px-tall hero element. Rejected as not discreet; replaced with a 120×28px waveform in the toolbar.</w:t>
+            </w:r>
+          </w:p>
+        </w:tc>
+      </w:tr>
+      <w:tr>
+        <w:tblPrEx>
+          <w:tblCellMar>
+            <w:top w:w="0" w:type="dxa"/>
+            <w:bottom w:w="0" w:type="dxa"/>
+          </w:tblCellMar>
+        </w:tblPrEx>
+        <w:tc>
+          <w:tcPr>
+            <w:tcW w:w="2708" w:type="dxa"/>
+            <w:tcMar>
+              <w:top w:w="80" w:type="dxa"/>
+              <w:left w:w="110" w:type="dxa"/>
+              <w:bottom w:w="80" w:type="dxa"/>
+              <w:right w:w="110" w:type="dxa"/>
+            </w:tcMar>
+          </w:tcPr>
+          <w:p>
+            <w:pPr>
+              <w:spacing w:line="260" w:lineRule="auto"/>
+            </w:pPr>
+            <w:r>
+              <w:t>Transcript lines appeared out of order</w:t>
+            </w:r>
+          </w:p>
+        </w:tc>
+        <w:tc>
+          <w:tcPr>
+            <w:tcW w:w="6318" w:type="dxa"/>
+            <w:tcMar>
+              <w:top w:w="80" w:type="dxa"/>
+              <w:left w:w="110" w:type="dxa"/>
+              <w:bottom w:w="80" w:type="dxa"/>
+              <w:right w:w="110" w:type="dxa"/>
+            </w:tcMar>
+          </w:tcPr>
+          <w:p>
+            <w:pPr>
+              <w:spacing w:line="260" w:lineRule="auto"/>
+            </w:pPr>
+            <w:r>
+              <w:t xml:space="preserve">User transcription is produced by a separate </w:t>
+            </w:r>
+            <w:proofErr w:type="gramStart"/>
+            <w:r>
+              <w:t>model</w:t>
+            </w:r>
+            <w:proofErr w:type="gramEnd"/>
+            <w:r>
+              <w:t xml:space="preserve"> and its completed event routinely arrives after the assistant has begun replying. Appending on arrival put the user's words beneath the answer to them. Fixed by reserving the user's line on </w:t>
+            </w:r>
+            <w:proofErr w:type="spellStart"/>
+            <w:r>
+              <w:t>input_audio_buffer.committed</w:t>
+            </w:r>
+            <w:proofErr w:type="spellEnd"/>
+            <w:r>
+              <w:t xml:space="preserve"> (which fires immediately with an </w:t>
+            </w:r>
+            <w:proofErr w:type="spellStart"/>
+            <w:r>
+              <w:t>item_id</w:t>
+            </w:r>
+            <w:proofErr w:type="spellEnd"/>
+            <w:r>
+              <w:t xml:space="preserve">) and filling it by </w:t>
+            </w:r>
+            <w:proofErr w:type="spellStart"/>
+            <w:r>
+              <w:t>item_id</w:t>
+            </w:r>
+            <w:proofErr w:type="spellEnd"/>
+            <w:r>
+              <w:t xml:space="preserve"> when the transcription lands. A genuine characteristic of the Realtime API, not a transient bug — any transcript UI on this API needs the same treatment.</w:t>
+            </w:r>
+          </w:p>
+        </w:tc>
+      </w:tr>
+      <w:tr>
+        <w:tblPrEx>
+          <w:tblCellMar>
+            <w:top w:w="0" w:type="dxa"/>
+            <w:bottom w:w="0" w:type="dxa"/>
+          </w:tblCellMar>
+        </w:tblPrEx>
+        <w:tc>
+          <w:tcPr>
+            <w:tcW w:w="2708" w:type="dxa"/>
+            <w:tcMar>
+              <w:top w:w="80" w:type="dxa"/>
+              <w:left w:w="110" w:type="dxa"/>
+              <w:bottom w:w="80" w:type="dxa"/>
+              <w:right w:w="110" w:type="dxa"/>
+            </w:tcMar>
+          </w:tcPr>
+          <w:p>
+            <w:pPr>
+              <w:spacing w:line="260" w:lineRule="auto"/>
+            </w:pPr>
+            <w:r>
+              <w:t>Whole page jumped while the model spoke</w:t>
+            </w:r>
+          </w:p>
+        </w:tc>
+        <w:tc>
+          <w:tcPr>
+            <w:tcW w:w="6318" w:type="dxa"/>
+            <w:tcMar>
+              <w:top w:w="80" w:type="dxa"/>
+              <w:left w:w="110" w:type="dxa"/>
+              <w:bottom w:w="80" w:type="dxa"/>
+              <w:right w:w="110" w:type="dxa"/>
+            </w:tcMar>
+          </w:tcPr>
+          <w:p>
+            <w:pPr>
+              <w:spacing w:line="260" w:lineRule="auto"/>
+            </w:pPr>
+            <w:r>
+              <w:t xml:space="preserve">Three compounding causes. The transcript box had a max-height but no fixed height, so it grew with every streamed word until it hit the cap. The speaker pill lost its base CSS class on first update (a class-name mismatch between JS and CSS), becoming an </w:t>
+            </w:r>
+            <w:proofErr w:type="spellStart"/>
+            <w:r>
+              <w:t>unstyled</w:t>
+            </w:r>
+            <w:proofErr w:type="spellEnd"/>
+            <w:r>
+              <w:t xml:space="preserve"> span whose width changed many times a second and reflowed the toolbar. And browser scroll anchoring on the document re-adjusted the window scroll as content changed. Fixed with a fixed transcript height, the correct pill class plus a min-width, and overflow-anchor: none on html.</w:t>
+            </w:r>
+          </w:p>
+        </w:tc>
+      </w:tr>
+      <w:tr>
+        <w:tblPrEx>
+          <w:tblCellMar>
+            <w:top w:w="0" w:type="dxa"/>
+            <w:bottom w:w="0" w:type="dxa"/>
+          </w:tblCellMar>
+        </w:tblPrEx>
+        <w:tc>
+          <w:tcPr>
+            <w:tcW w:w="2708" w:type="dxa"/>
+            <w:tcMar>
+              <w:top w:w="80" w:type="dxa"/>
+              <w:left w:w="110" w:type="dxa"/>
+              <w:bottom w:w="80" w:type="dxa"/>
+              <w:right w:w="110" w:type="dxa"/>
+            </w:tcMar>
+          </w:tcPr>
+          <w:p>
+            <w:pPr>
+              <w:spacing w:line="260" w:lineRule="auto"/>
+            </w:pPr>
+            <w:r>
+              <w:t>Visualiser wrapped under the buttons on connect</w:t>
+            </w:r>
+          </w:p>
+        </w:tc>
+        <w:tc>
+          <w:tcPr>
+            <w:tcW w:w="6318" w:type="dxa"/>
+            <w:tcMar>
+              <w:top w:w="80" w:type="dxa"/>
+              <w:left w:w="110" w:type="dxa"/>
+              <w:bottom w:w="80" w:type="dxa"/>
+              <w:right w:w="110" w:type="dxa"/>
+            </w:tcMar>
+          </w:tcPr>
+          <w:p>
+            <w:pPr>
+              <w:spacing w:line="260" w:lineRule="auto"/>
+            </w:pPr>
+            <w:r>
+              <w:t xml:space="preserve">The toolbar allowed flex wrapping; a longer status message on connect pushed the right-hand group onto a second row. Fixed with flex-wrap: </w:t>
+            </w:r>
+            <w:proofErr w:type="spellStart"/>
+            <w:r>
+              <w:lastRenderedPageBreak/>
+              <w:t>nowrap</w:t>
+            </w:r>
+            <w:proofErr w:type="spellEnd"/>
+            <w:r>
+              <w:t xml:space="preserve"> on desktop, a truncating status label, and shorter status text. Wrapping is retained under 600px.</w:t>
+            </w:r>
+          </w:p>
+        </w:tc>
+      </w:tr>
+      <w:tr>
+        <w:tblPrEx>
+          <w:tblCellMar>
+            <w:top w:w="0" w:type="dxa"/>
+            <w:bottom w:w="0" w:type="dxa"/>
+          </w:tblCellMar>
+        </w:tblPrEx>
+        <w:tc>
+          <w:tcPr>
+            <w:tcW w:w="2708" w:type="dxa"/>
+            <w:tcMar>
+              <w:top w:w="80" w:type="dxa"/>
+              <w:left w:w="110" w:type="dxa"/>
+              <w:bottom w:w="80" w:type="dxa"/>
+              <w:right w:w="110" w:type="dxa"/>
+            </w:tcMar>
+          </w:tcPr>
+          <w:p>
+            <w:pPr>
+              <w:spacing w:line="260" w:lineRule="auto"/>
+            </w:pPr>
+            <w:r>
+              <w:lastRenderedPageBreak/>
+              <w:t>Remove-document × did nothing visibly</w:t>
+            </w:r>
+          </w:p>
+        </w:tc>
+        <w:tc>
+          <w:tcPr>
+            <w:tcW w:w="6318" w:type="dxa"/>
+            <w:tcMar>
+              <w:top w:w="80" w:type="dxa"/>
+              <w:left w:w="110" w:type="dxa"/>
+              <w:bottom w:w="80" w:type="dxa"/>
+              <w:right w:w="110" w:type="dxa"/>
+            </w:tcMar>
+          </w:tcPr>
+          <w:p>
+            <w:pPr>
+              <w:spacing w:line="260" w:lineRule="auto"/>
+            </w:pPr>
+            <w:r>
+              <w:t>The pill was hidden by setting the HTML hidden attribute, but a CSS display: inline-flex rule on the same element overrides hidden. Fixed with an explicit [hidden] { display: none } rule. The document was being removed server-side; only the visual state was stuck.</w:t>
             </w:r>
           </w:p>
         </w:tc>
@@ -9924,7 +10338,7 @@
       <w:pPr>
         <w:pStyle w:val="Heading1"/>
       </w:pPr>
-      <w:bookmarkStart w:id="18" w:name="_Toc237893320"/>
+      <w:bookmarkStart w:id="18" w:name="_Toc237895088"/>
       <w:r>
         <w:t>12. Deployment</w:t>
       </w:r>
@@ -10363,7 +10777,68 @@
               <w:spacing w:line="260" w:lineRule="auto"/>
             </w:pPr>
             <w:r>
-              <w:lastRenderedPageBreak/>
+              <w:t>Image contents</w:t>
+            </w:r>
+          </w:p>
+        </w:tc>
+        <w:tc>
+          <w:tcPr>
+            <w:tcW w:w="7020" w:type="dxa"/>
+            <w:tcMar>
+              <w:top w:w="80" w:type="dxa"/>
+              <w:left w:w="110" w:type="dxa"/>
+              <w:bottom w:w="80" w:type="dxa"/>
+              <w:right w:w="110" w:type="dxa"/>
+            </w:tcMar>
+          </w:tcPr>
+          <w:p>
+            <w:pPr>
+              <w:spacing w:line="260" w:lineRule="auto"/>
+            </w:pPr>
+            <w:r>
+              <w:t>.</w:t>
+            </w:r>
+            <w:proofErr w:type="spellStart"/>
+            <w:r>
+              <w:t>dockerignore</w:t>
+            </w:r>
+            <w:proofErr w:type="spellEnd"/>
+            <w:r>
+              <w:t xml:space="preserve"> excludes bin/, </w:t>
+            </w:r>
+            <w:proofErr w:type="spellStart"/>
+            <w:r>
+              <w:t>obj</w:t>
+            </w:r>
+            <w:proofErr w:type="spellEnd"/>
+            <w:r>
+              <w:t>/, .git/, markdown, zips, .env and the architecture/ folder, so documentation is versioned in GitHub but not shipped in the container.</w:t>
+            </w:r>
+          </w:p>
+        </w:tc>
+      </w:tr>
+      <w:tr>
+        <w:tblPrEx>
+          <w:tblCellMar>
+            <w:top w:w="0" w:type="dxa"/>
+            <w:bottom w:w="0" w:type="dxa"/>
+          </w:tblCellMar>
+        </w:tblPrEx>
+        <w:tc>
+          <w:tcPr>
+            <w:tcW w:w="2006" w:type="dxa"/>
+            <w:tcMar>
+              <w:top w:w="80" w:type="dxa"/>
+              <w:left w:w="110" w:type="dxa"/>
+              <w:bottom w:w="80" w:type="dxa"/>
+              <w:right w:w="110" w:type="dxa"/>
+            </w:tcMar>
+          </w:tcPr>
+          <w:p>
+            <w:pPr>
+              <w:spacing w:line="260" w:lineRule="auto"/>
+            </w:pPr>
+            <w:r>
               <w:t>Cold start</w:t>
             </w:r>
           </w:p>
@@ -10398,7 +10873,7 @@
       <w:pPr>
         <w:pStyle w:val="Heading1"/>
       </w:pPr>
-      <w:bookmarkStart w:id="19" w:name="_Toc237893321"/>
+      <w:bookmarkStart w:id="19" w:name="_Toc237895089"/>
       <w:r>
         <w:t>13. Setup and Running</w:t>
       </w:r>
@@ -10408,7 +10883,7 @@
       <w:pPr>
         <w:pStyle w:val="Heading2"/>
       </w:pPr>
-      <w:bookmarkStart w:id="20" w:name="_Toc237893322"/>
+      <w:bookmarkStart w:id="20" w:name="_Toc237895090"/>
       <w:r>
         <w:t>13.1 Prerequisites</w:t>
       </w:r>
@@ -10457,7 +10932,7 @@
       <w:pPr>
         <w:pStyle w:val="Heading2"/>
       </w:pPr>
-      <w:bookmarkStart w:id="21" w:name="_Toc237893323"/>
+      <w:bookmarkStart w:id="21" w:name="_Toc237895091"/>
       <w:r>
         <w:t>13.2 Run locally</w:t>
       </w:r>
@@ -10509,7 +10984,7 @@
       <w:pPr>
         <w:pStyle w:val="Heading2"/>
       </w:pPr>
-      <w:bookmarkStart w:id="22" w:name="_Toc237893324"/>
+      <w:bookmarkStart w:id="22" w:name="_Toc237895092"/>
       <w:r>
         <w:t>13.3 Run locally in Docker</w:t>
       </w:r>
@@ -10566,8 +11041,9 @@
       <w:pPr>
         <w:pStyle w:val="Heading2"/>
       </w:pPr>
-      <w:bookmarkStart w:id="23" w:name="_Toc237893325"/>
-      <w:r>
+      <w:bookmarkStart w:id="23" w:name="_Toc237895093"/>
+      <w:r>
+        <w:lastRenderedPageBreak/>
         <w:t>13.4 Deploy</w:t>
       </w:r>
       <w:bookmarkEnd w:id="23"/>
@@ -10594,7 +11070,7 @@
       <w:pPr>
         <w:pStyle w:val="Heading1"/>
       </w:pPr>
-      <w:bookmarkStart w:id="24" w:name="_Toc237893326"/>
+      <w:bookmarkStart w:id="24" w:name="_Toc237895094"/>
       <w:r>
         <w:t>14. Assumptions and Constraints</w:t>
       </w:r>
@@ -10604,7 +11080,7 @@
       <w:pPr>
         <w:pStyle w:val="Heading2"/>
       </w:pPr>
-      <w:bookmarkStart w:id="25" w:name="_Toc237893327"/>
+      <w:bookmarkStart w:id="25" w:name="_Toc237895095"/>
       <w:r>
         <w:t>14.1 Assumptions</w:t>
       </w:r>
@@ -10653,7 +11129,7 @@
       <w:pPr>
         <w:pStyle w:val="Heading2"/>
       </w:pPr>
-      <w:bookmarkStart w:id="26" w:name="_Toc237893328"/>
+      <w:bookmarkStart w:id="26" w:name="_Toc237895096"/>
       <w:r>
         <w:t>14.2 Constraints</w:t>
       </w:r>
@@ -10737,7 +11213,6 @@
         <w:spacing w:after="100" w:line="276" w:lineRule="auto"/>
       </w:pPr>
       <w:r>
-        <w:lastRenderedPageBreak/>
         <w:t>Render's free tier cold start is worked around operationally (open the page early), not architecturally.</w:t>
       </w:r>
     </w:p>
@@ -10750,7 +11225,7 @@
       <w:pPr>
         <w:pStyle w:val="Heading1"/>
       </w:pPr>
-      <w:bookmarkStart w:id="27" w:name="_Toc237893329"/>
+      <w:bookmarkStart w:id="27" w:name="_Toc237895097"/>
       <w:r>
         <w:t>15. Future Extension Path</w:t>
       </w:r>
@@ -11062,6 +11537,7 @@
               <w:spacing w:line="260" w:lineRule="auto"/>
             </w:pPr>
             <w:r>
+              <w:lastRenderedPageBreak/>
               <w:t>Access gate</w:t>
             </w:r>
           </w:p>
@@ -11302,7 +11778,7 @@
         <w:sz w:val="16"/>
         <w:szCs w:val="16"/>
       </w:rPr>
-      <w:t xml:space="preserve">VOICECHAT-SA-v1.3  ·  Page </w:t>
+      <w:t xml:space="preserve">VOICECHAT-SA-v1.4  ·  Page </w:t>
     </w:r>
     <w:r>
       <w:rPr>
@@ -11371,64 +11847,10 @@
 <file path=word/numbering.xml><?xml version="1.0" encoding="utf-8"?>
 <w:numbering xmlns:wpc="http://schemas.microsoft.com/office/word/2010/wordprocessingCanvas" xmlns:cx="http://schemas.microsoft.com/office/drawing/2014/chartex" xmlns:cx1="http://schemas.microsoft.com/office/drawing/2015/9/8/chartex" xmlns:cx2="http://schemas.microsoft.com/office/drawing/2015/10/21/chartex" xmlns:cx3="http://schemas.microsoft.com/office/drawing/2016/5/9/chartex" xmlns:cx4="http://schemas.microsoft.com/office/drawing/2016/5/10/chartex" xmlns:cx5="http://schemas.microsoft.com/office/drawing/2016/5/11/chartex" xmlns:cx6="http://schemas.microsoft.com/office/drawing/2016/5/12/chartex" xmlns:cx7="http://schemas.microsoft.com/office/drawing/2016/5/13/chartex" xmlns:cx8="http://schemas.microsoft.com/office/drawing/2016/5/14/chartex" xmlns:mc="http://schemas.openxmlformats.org/markup-compatibility/2006" xmlns:aink="http://schemas.microsoft.com/office/drawing/2016/ink" xmlns:am3d="http://schemas.microsoft.com/office/drawing/2017/model3d" xmlns:o="urn:schemas-microsoft-com:office:office" xmlns:oel="http://schemas.microsoft.com/office/2019/extlst" xmlns:r="http://schemas.openxmlformats.org/officeDocument/2006/relationships" xmlns:m="http://schemas.openxmlformats.org/officeDocument/2006/math" xmlns:v="urn:schemas-microsoft-com:vml" xmlns:wp14="http://schemas.microsoft.com/office/word/2010/wordprocessingDrawing" xmlns:wp="http://schemas.openxmlformats.org/drawingml/2006/wordprocessingDrawing" xmlns:w10="urn:schemas-microsoft-com:office:word" xmlns:w="http://schemas.openxmlformats.org/wordprocessingml/2006/main" xmlns:w14="http://schemas.microsoft.com/office/word/2010/wordml" xmlns:w15="http://schemas.microsoft.com/office/word/2012/wordml" xmlns:w16cei="http://schemas.microsoft.com/office/word/2026/wordml/cei" xmlns:w16cex="http://schemas.microsoft.com/office/word/2018/wordml/cex" xmlns:w16cid="http://schemas.microsoft.com/office/word/2016/wordml/cid" xmlns:w16="http://schemas.microsoft.com/office/word/2018/wordml" xmlns:w16du="http://schemas.microsoft.com/office/word/2023/wordml/word16du" xmlns:w16sdtdh="http://schemas.microsoft.com/office/word/2020/wordml/sdtdatahash" xmlns:w16sdtfl="http://schemas.microsoft.com/office/word/2024/wordml/sdtformatlock" xmlns:w16se="http://schemas.microsoft.com/office/word/2015/wordml/symex" xmlns:wpg="http://schemas.microsoft.com/office/word/2010/wordprocessingGroup" xmlns:wpi="http://schemas.microsoft.com/office/word/2010/wordprocessingInk" xmlns:wne="http://schemas.microsoft.com/office/word/2006/wordml" xmlns:wps="http://schemas.microsoft.com/office/word/2010/wordprocessingShape" mc:Ignorable="w14 w15 w16se w16cid w16 w16cex w16sdtdh w16sdtfl w16du wp14">
   <w:abstractNum w:abstractNumId="0" w15:restartNumberingAfterBreak="0">
-    <w:nsid w:val="01083343"/>
+    <w:nsid w:val="36FD548E"/>
     <w:multiLevelType w:val="hybridMultilevel"/>
-    <w:tmpl w:val="78526E2E"/>
-    <w:lvl w:ilvl="0" w:tplc="3244B68C">
-      <w:start w:val="1"/>
-      <w:numFmt w:val="bullet"/>
-      <w:lvlText w:val="•"/>
-      <w:lvlJc w:val="left"/>
-      <w:pPr>
-        <w:ind w:left="540" w:hanging="260"/>
-      </w:pPr>
-    </w:lvl>
-    <w:lvl w:ilvl="1" w:tplc="961051EA">
-      <w:numFmt w:val="decimal"/>
-      <w:lvlText w:val=""/>
-      <w:lvlJc w:val="left"/>
-    </w:lvl>
-    <w:lvl w:ilvl="2" w:tplc="E966827C">
-      <w:numFmt w:val="decimal"/>
-      <w:lvlText w:val=""/>
-      <w:lvlJc w:val="left"/>
-    </w:lvl>
-    <w:lvl w:ilvl="3" w:tplc="467ED0B8">
-      <w:numFmt w:val="decimal"/>
-      <w:lvlText w:val=""/>
-      <w:lvlJc w:val="left"/>
-    </w:lvl>
-    <w:lvl w:ilvl="4" w:tplc="DBB085D2">
-      <w:numFmt w:val="decimal"/>
-      <w:lvlText w:val=""/>
-      <w:lvlJc w:val="left"/>
-    </w:lvl>
-    <w:lvl w:ilvl="5" w:tplc="3192F5B4">
-      <w:numFmt w:val="decimal"/>
-      <w:lvlText w:val=""/>
-      <w:lvlJc w:val="left"/>
-    </w:lvl>
-    <w:lvl w:ilvl="6" w:tplc="AF0E23A6">
-      <w:numFmt w:val="decimal"/>
-      <w:lvlText w:val=""/>
-      <w:lvlJc w:val="left"/>
-    </w:lvl>
-    <w:lvl w:ilvl="7" w:tplc="E1D68E0A">
-      <w:numFmt w:val="decimal"/>
-      <w:lvlText w:val=""/>
-      <w:lvlJc w:val="left"/>
-    </w:lvl>
-    <w:lvl w:ilvl="8" w:tplc="B8F40E2A">
-      <w:numFmt w:val="decimal"/>
-      <w:lvlText w:val=""/>
-      <w:lvlJc w:val="left"/>
-    </w:lvl>
-  </w:abstractNum>
-  <w:abstractNum w:abstractNumId="1" w15:restartNumberingAfterBreak="0">
-    <w:nsid w:val="09B80968"/>
-    <w:multiLevelType w:val="hybridMultilevel"/>
-    <w:tmpl w:val="3DEA93C6"/>
-    <w:lvl w:ilvl="0" w:tplc="BBB6CA4C">
+    <w:tmpl w:val="399C6B36"/>
+    <w:lvl w:ilvl="0" w:tplc="75DAA0A0">
       <w:start w:val="1"/>
       <w:numFmt w:val="bullet"/>
       <w:lvlText w:val="●"/>
@@ -11437,7 +11859,7 @@
         <w:ind w:left="720" w:hanging="360"/>
       </w:pPr>
     </w:lvl>
-    <w:lvl w:ilvl="1" w:tplc="4F3C0CF2">
+    <w:lvl w:ilvl="1" w:tplc="A0485F44">
       <w:start w:val="1"/>
       <w:numFmt w:val="bullet"/>
       <w:lvlText w:val="○"/>
@@ -11446,7 +11868,7 @@
         <w:ind w:left="1440" w:hanging="360"/>
       </w:pPr>
     </w:lvl>
-    <w:lvl w:ilvl="2" w:tplc="F402841A">
+    <w:lvl w:ilvl="2" w:tplc="13BA1132">
       <w:start w:val="1"/>
       <w:numFmt w:val="bullet"/>
       <w:lvlText w:val="■"/>
@@ -11455,7 +11877,7 @@
         <w:ind w:left="2160" w:hanging="360"/>
       </w:pPr>
     </w:lvl>
-    <w:lvl w:ilvl="3" w:tplc="7C5EAF1E">
+    <w:lvl w:ilvl="3" w:tplc="21588804">
       <w:start w:val="1"/>
       <w:numFmt w:val="bullet"/>
       <w:lvlText w:val="●"/>
@@ -11464,7 +11886,7 @@
         <w:ind w:left="2880" w:hanging="360"/>
       </w:pPr>
     </w:lvl>
-    <w:lvl w:ilvl="4" w:tplc="831084C8">
+    <w:lvl w:ilvl="4" w:tplc="9AC05936">
       <w:start w:val="1"/>
       <w:numFmt w:val="bullet"/>
       <w:lvlText w:val="○"/>
@@ -11473,7 +11895,7 @@
         <w:ind w:left="3600" w:hanging="360"/>
       </w:pPr>
     </w:lvl>
-    <w:lvl w:ilvl="5" w:tplc="9590477E">
+    <w:lvl w:ilvl="5" w:tplc="F7E2213E">
       <w:start w:val="1"/>
       <w:numFmt w:val="bullet"/>
       <w:lvlText w:val="■"/>
@@ -11482,7 +11904,7 @@
         <w:ind w:left="4320" w:hanging="360"/>
       </w:pPr>
     </w:lvl>
-    <w:lvl w:ilvl="6" w:tplc="32AEB56C">
+    <w:lvl w:ilvl="6" w:tplc="95F8D88A">
       <w:start w:val="1"/>
       <w:numFmt w:val="bullet"/>
       <w:lvlText w:val="●"/>
@@ -11491,7 +11913,7 @@
         <w:ind w:left="5040" w:hanging="360"/>
       </w:pPr>
     </w:lvl>
-    <w:lvl w:ilvl="7" w:tplc="66461BD6">
+    <w:lvl w:ilvl="7" w:tplc="DE62D33A">
       <w:start w:val="1"/>
       <w:numFmt w:val="bullet"/>
       <w:lvlText w:val="●"/>
@@ -11500,7 +11922,7 @@
         <w:ind w:left="5760" w:hanging="360"/>
       </w:pPr>
     </w:lvl>
-    <w:lvl w:ilvl="8" w:tplc="3FF05F92">
+    <w:lvl w:ilvl="8" w:tplc="0C9C2EBE">
       <w:start w:val="1"/>
       <w:numFmt w:val="bullet"/>
       <w:lvlText w:val="●"/>
@@ -11510,14 +11932,68 @@
       </w:pPr>
     </w:lvl>
   </w:abstractNum>
-  <w:num w:numId="1" w16cid:durableId="1612126465">
-    <w:abstractNumId w:val="1"/>
+  <w:abstractNum w:abstractNumId="1" w15:restartNumberingAfterBreak="0">
+    <w:nsid w:val="60822339"/>
+    <w:multiLevelType w:val="hybridMultilevel"/>
+    <w:tmpl w:val="0B645EFE"/>
+    <w:lvl w:ilvl="0" w:tplc="8B98B838">
+      <w:start w:val="1"/>
+      <w:numFmt w:val="bullet"/>
+      <w:lvlText w:val="•"/>
+      <w:lvlJc w:val="left"/>
+      <w:pPr>
+        <w:ind w:left="540" w:hanging="260"/>
+      </w:pPr>
+    </w:lvl>
+    <w:lvl w:ilvl="1" w:tplc="CD9674E2">
+      <w:numFmt w:val="decimal"/>
+      <w:lvlText w:val=""/>
+      <w:lvlJc w:val="left"/>
+    </w:lvl>
+    <w:lvl w:ilvl="2" w:tplc="94DA175A">
+      <w:numFmt w:val="decimal"/>
+      <w:lvlText w:val=""/>
+      <w:lvlJc w:val="left"/>
+    </w:lvl>
+    <w:lvl w:ilvl="3" w:tplc="581A7442">
+      <w:numFmt w:val="decimal"/>
+      <w:lvlText w:val=""/>
+      <w:lvlJc w:val="left"/>
+    </w:lvl>
+    <w:lvl w:ilvl="4" w:tplc="774ADCBC">
+      <w:numFmt w:val="decimal"/>
+      <w:lvlText w:val=""/>
+      <w:lvlJc w:val="left"/>
+    </w:lvl>
+    <w:lvl w:ilvl="5" w:tplc="ADB814BC">
+      <w:numFmt w:val="decimal"/>
+      <w:lvlText w:val=""/>
+      <w:lvlJc w:val="left"/>
+    </w:lvl>
+    <w:lvl w:ilvl="6" w:tplc="EC5C1AA2">
+      <w:numFmt w:val="decimal"/>
+      <w:lvlText w:val=""/>
+      <w:lvlJc w:val="left"/>
+    </w:lvl>
+    <w:lvl w:ilvl="7" w:tplc="404AB49A">
+      <w:numFmt w:val="decimal"/>
+      <w:lvlText w:val=""/>
+      <w:lvlJc w:val="left"/>
+    </w:lvl>
+    <w:lvl w:ilvl="8" w:tplc="F1E222D0">
+      <w:numFmt w:val="decimal"/>
+      <w:lvlText w:val=""/>
+      <w:lvlJc w:val="left"/>
+    </w:lvl>
+  </w:abstractNum>
+  <w:num w:numId="1" w16cid:durableId="1042285395">
+    <w:abstractNumId w:val="0"/>
     <w:lvlOverride w:ilvl="0">
       <w:startOverride w:val="1"/>
     </w:lvlOverride>
   </w:num>
-  <w:num w:numId="2" w16cid:durableId="199054488">
-    <w:abstractNumId w:val="0"/>
+  <w:num w:numId="2" w16cid:durableId="124348569">
+    <w:abstractNumId w:val="1"/>
     <w:lvlOverride w:ilvl="0">
       <w:startOverride w:val="1"/>
     </w:lvlOverride>
@@ -12125,7 +12601,7 @@
     <w:uiPriority w:val="39"/>
     <w:unhideWhenUsed/>
     <w:qFormat/>
-    <w:rsid w:val="00196F3A"/>
+    <w:rsid w:val="006D11A5"/>
     <w:pPr>
       <w:keepNext/>
       <w:keepLines/>
@@ -12149,7 +12625,7 @@
     <w:autoRedefine/>
     <w:uiPriority w:val="39"/>
     <w:unhideWhenUsed/>
-    <w:rsid w:val="00196F3A"/>
+    <w:rsid w:val="006D11A5"/>
     <w:pPr>
       <w:spacing w:after="100"/>
     </w:pPr>
@@ -12161,7 +12637,7 @@
     <w:autoRedefine/>
     <w:uiPriority w:val="39"/>
     <w:unhideWhenUsed/>
-    <w:rsid w:val="00196F3A"/>
+    <w:rsid w:val="006D11A5"/>
     <w:pPr>
       <w:spacing w:after="100"/>
       <w:ind w:left="200"/>
@@ -12490,7 +12966,7 @@
 </file>
 
 <file path=customXml/itemProps1.xml><?xml version="1.0" encoding="utf-8"?>
-<ds:datastoreItem xmlns:ds="http://schemas.openxmlformats.org/officeDocument/2006/customXml" ds:itemID="{01CF51B1-C5D0-4D8C-A178-0394EA3D474F}">
+<ds:datastoreItem xmlns:ds="http://schemas.openxmlformats.org/officeDocument/2006/customXml" ds:itemID="{4B4AE7A6-3C6C-410E-BCB5-A95D4E246B41}">
   <ds:schemaRefs>
     <ds:schemaRef ds:uri="http://schemas.openxmlformats.org/officeDocument/2006/bibliography"/>
   </ds:schemaRefs>

</xml_diff>